<commit_message>
Update resume with Inspire Media work
</commit_message>
<xml_diff>
--- a/assets/resume/Joel_Jojy_Design_Engineer_Resume.docx
+++ b/assets/resume/Joel_Jojy_Design_Engineer_Resume.docx
@@ -274,6 +274,38 @@
         <w:pStyle w:val="Heading2"/>
       </w:pPr>
       <w:r>
+        <w:t>Design Engineer and Frontend Developer | Inspire Media | Dubai, UAE | Sep 2026</w:t>
+      </w:r>
+    </w:p>
+    <w:p>
+      <w:pPr>
+        <w:pStyle w:val="ResumeBullet"/>
+      </w:pPr>
+      <w:r>
+        <w:t>- Designed and shipped a responsive React and Vite portfolio for a Dubai creative studio with an infinite draggable gallery, looping video previews, category collections, full-length playback, and Cloudflare Pages/R2 deployment.</w:t>
+      </w:r>
+    </w:p>
+    <w:p>
+      <w:pPr>
+        <w:pStyle w:val="ResumeBullet"/>
+      </w:pPr>
+      <w:r>
+        <w:t>- Built motion-led media interactions and production-ready frontend flows using AI-assisted development while preserving responsive performance and brand storytelling.</w:t>
+      </w:r>
+    </w:p>
+    <w:p>
+      <w:pPr>
+        <w:pStyle w:val="ResumeBullet"/>
+      </w:pPr>
+      <w:r>
+        <w:t>- Created an animated UX case study to communicate product decisions, interaction model, technical execution, and end-to-end build process.</w:t>
+      </w:r>
+    </w:p>
+    <w:p>
+      <w:pPr>
+        <w:pStyle w:val="Heading2"/>
+      </w:pPr>
+      <w:r>
         <w:rPr>
           <w:rFonts w:ascii="Aptos" w:hAnsi="Aptos"/>
           <w:b/>
@@ -346,7 +378,7 @@
           <w:color w:val="000000"/>
           <w:sz w:val="18"/>
         </w:rPr>
-        <w:t>- Designed and deployed the complete landing page for a cybersecurity startup, translating the brand position "Security That Thinks" into a minimal intelligence-led interface.</w:t>
+        <w:t>- Designed the web and product experience for Aegis Graph, a cloud security remediation product that detects AWS misconfigurations, maps blast radius on a resource graph, and supports safe remediation.</w:t>
       </w:r>
     </w:p>
     <w:p>
@@ -359,7 +391,7 @@
           <w:color w:val="000000"/>
           <w:sz w:val="18"/>
         </w:rPr>
-        <w:t>- Implemented the production website with an AI-assisted frontend workflow using OpenAI Codex, owning design direction through deployment.</w:t>
+        <w:t>- Translated complex security workflows into product flows for detection, risk context, policy-gated action, approval, rollback, verification, monitoring, and audit trails.</w:t>
       </w:r>
     </w:p>
     <w:p>
@@ -372,7 +404,7 @@
           <w:color w:val="000000"/>
           <w:sz w:val="18"/>
         </w:rPr>
-        <w:t>- Defined early product flows, information architecture, and reusable component patterns for the company's upcoming security tool.</w:t>
+        <w:t>- Designed and deployed the company's web presence with an AI-assisted frontend workflow using OpenAI Codex, connecting product positioning with a production-ready interface.</w:t>
       </w:r>
     </w:p>
     <w:p>
@@ -603,21 +635,7 @@
     </w:p>
     <w:p>
       <w:r>
-        <w:rPr>
-          <w:rFonts w:ascii="Aptos" w:hAnsi="Aptos"/>
-          <w:b/>
-          <w:color w:val="000000"/>
-          <w:sz w:val="18"/>
-        </w:rPr>
-        <w:t xml:space="preserve">Cafe Meadows PWA Digital Menu: </w:t>
-      </w:r>
-      <w:r>
-        <w:rPr>
-          <w:rFonts w:ascii="Aptos" w:hAnsi="Aptos"/>
-          <w:color w:val="000000"/>
-          <w:sz w:val="18"/>
-        </w:rPr>
-        <w:t>Designed and built a Google Sheets-backed PWA with real-time menu management, search, food-first browsing, AED cart interaction, and Netlify deployment.</w:t>
+        <w:t>Inspire Media Creative Portfolio: Designed and built a React/Vite media portfolio with infinite draggable gallery, video preview interactions, category browsing, full-length playback, responsive layouts, Cloudflare deployment, and an animated UX case study.</w:t>
       </w:r>
     </w:p>
     <w:p>
@@ -628,7 +646,7 @@
           <w:color w:val="000000"/>
           <w:sz w:val="18"/>
         </w:rPr>
-        <w:t xml:space="preserve">Vaytrion Cybersecurity Website: </w:t>
+        <w:t xml:space="preserve">Aegis Graph Cloud Security Product: </w:t>
       </w:r>
       <w:r>
         <w:rPr>
@@ -636,7 +654,7 @@
           <w:color w:val="000000"/>
           <w:sz w:val="18"/>
         </w:rPr>
-        <w:t>Designed and deployed a cybersecurity startup landing page and early product direction using Figma, OpenAI Codex, and AI-assisted frontend workflows.</w:t>
+        <w:t>Designed product flows and web experience for a cybersecurity product covering misconfiguration detection, blast-radius context, policy-gated remediation, rollback, and audit trails.</w:t>
       </w:r>
     </w:p>
     <w:p>
@@ -647,7 +665,7 @@
           <w:color w:val="000000"/>
           <w:sz w:val="18"/>
         </w:rPr>
-        <w:t xml:space="preserve">BankDash Finance Management Dashboard: </w:t>
+        <w:t xml:space="preserve">Maha Meru Innovation E-commerce Experience: </w:t>
       </w:r>
       <w:r>
         <w:rPr>
@@ -655,7 +673,7 @@
           <w:color w:val="000000"/>
           <w:sz w:val="18"/>
         </w:rPr>
-        <w:t>Designed a fintech dashboard system with responsive components, data visualization interfaces, and consistent UI patterns across web and mobile.</w:t>
+        <w:t>Designed responsive marketplace experiences, reusable UI patterns, and handoff-ready interface states across browsing, product discovery, and commerce flows.</w:t>
       </w:r>
     </w:p>
     <w:p>

</xml_diff>